<commit_message>
Add second author: Ana María Barrera Rodríguez
Both manuscript versions now credit Daniel Aristizábal Torres and Ana
María Barrera Rodríguez. The QSS/Q2 draft (v0.1) already wrote in
plural "we" throughout, so only the title block changed. The Learned
Publishing draft was written in first-person singular ("I") under a
single-author assumption; converted every instance to "we"/"our"/"ours"
across Introduction, Methods, Results, Discussion, Conclusion, section
headings, and the conflict-of-interest statement, and verified zero
stray singular pronouns remain in the rendered text.

Two items flagged for the authors to confirm in both files: Ana María's
affiliation and ORCID iD, and her specific contribution for the CRediT
statement (which also affects author order, if Aristizábal Torres
should not be listed first).
</commit_message>
<xml_diff>
--- a/Manuscrito_LearnedPublishing_v1.docx
+++ b/Manuscrito_LearnedPublishing_v1.docx
@@ -26,7 +26,7 @@
           <w:i w:val="0"/>
           <w:sz w:val="24"/>
         </w:rPr>
-        <w:t>Daniel Aristizábal Torres</w:t>
+        <w:t>Daniel Aristizábal Torres¹ and Ana María Barrera Rodríguez²</w:t>
       </w:r>
     </w:p>
     <w:p>
@@ -41,7 +41,7 @@
           <w:color w:val="595959"/>
           <w:sz w:val="20"/>
         </w:rPr>
-        <w:t>Independent Researcher — Scientometrics and Research Integrity</w:t>
+        <w:t>¹ Independent Researcher — Scientometrics and Research Integrity   ·   ² [affiliation to confirm]</w:t>
       </w:r>
     </w:p>
     <w:p>
@@ -56,7 +56,7 @@
           <w:color w:val="595959"/>
           <w:sz w:val="18"/>
         </w:rPr>
-        <w:t>danielaristo@yahoo.com  ·  ORCID: [author to insert]  ·  github.com/danielaristo/reference-integrity-checker</w:t>
+        <w:t>danielaristo@yahoo.com  ·  [Ana María Barrera Rodríguez's email — to confirm]  ·  ORCID: [both authors to insert]  ·  github.com/danielaristo/reference-integrity-checker</w:t>
       </w:r>
     </w:p>
     <w:p>
@@ -97,7 +97,7 @@
           <w:color w:val="6B5900"/>
           <w:sz w:val="18"/>
         </w:rPr>
-        <w:t>Learned Publishing requires an ORCID iD for every author (see Author Guidelines, "ORCID"). Register at orcid.org (2 minutes) and I will drop the ID into the title page and submission form.</w:t>
+        <w:t>Learned Publishing requires an ORCID iD for every author (see Author Guidelines, "ORCID"). Both authors should register at orcid.org (2 minutes each) and send the two IDs so they can go on the title page and submission form.</w:t>
       </w:r>
     </w:p>
     <w:p>
@@ -153,7 +153,7 @@
           <w:i w:val="0"/>
           <w:sz w:val="22"/>
         </w:rPr>
-        <w:t>Large language models sometimes invent citations that look real but do not exist. I asked how common this really is, and found the honest answer is hard to get: a search engine cannot tell a fabricated reference apart from a real one it simply cannot find. I built a free tool that checks references against Crossref, OpenAlex, and Semantic Scholar in sequence, then verified the survivors by hand. Applied to 5,000 unresolved reference strings from 2024 journal articles, it recovered 25% as real works the standard matcher had missed and flagged 12% as citing the right work under the wrong year. Of the 517 remaining references that looked like genuine articles but matched nothing, manual checking of the 101 most recent (2020 onward) found zero fabrications: every one was a real paper outside the major indexes, or one whose citation was too mangled to match. Raw "not found" rates dramatically overstate the fabrication problem. I release the checker as a free web tool at reftruth.com so editors and authors can run the same check themselves.</w:t>
+        <w:t>Large language models sometimes invent citations that look real but do not exist. We asked how common this really is, and found the honest answer is hard to get: a search engine cannot tell a fabricated reference apart from a real one it simply cannot find. We built a free tool that checks references against Crossref, OpenAlex, and Semantic Scholar in sequence, then verified the survivors by hand. Applied to 5,000 unresolved reference strings from 2024 journal articles, it recovered 25% as real works the standard matcher had missed and flagged 12% as citing the right work under the wrong year. Of the 517 remaining references that looked like genuine articles but matched nothing, manual checking of the 101 most recent (2020 onward) found zero fabrications: every one was a real paper outside the major indexes, or one whose citation was too mangled to match. Raw "not found" rates dramatically overstate the fabrication problem. We release the checker as a free web tool at reftruth.com so editors and authors can run the same check themselves.</w:t>
       </w:r>
     </w:p>
     <w:p>
@@ -310,7 +310,7 @@
           <w:i w:val="0"/>
           <w:sz w:val="22"/>
         </w:rPr>
-        <w:t xml:space="preserve"> argued that "hallucination" is too soft a word for this -- fabrication and falsification is more honest, and I use that framing here. The problem is not limited to one field: </w:t>
+        <w:t xml:space="preserve"> argued that "hallucination" is too soft a word for this -- fabrication and falsification is more honest, and we use that framing here. The problem is not limited to one field: </w:t>
       </w:r>
       <w:r>
         <w:rPr>
@@ -342,7 +342,7 @@
           <w:i w:val="0"/>
           <w:sz w:val="22"/>
         </w:rPr>
-        <w:t>). The checker I built takes the opposite approach: no model judgement, just a lookup against real databases.</w:t>
+        <w:t>). The checker we built takes the opposite approach: no model judgement, just a lookup against real databases.</w:t>
       </w:r>
     </w:p>
     <w:p>
@@ -624,7 +624,7 @@
           <w:i w:val="0"/>
           <w:sz w:val="22"/>
         </w:rPr>
-        <w:t>This is the gap I set out to close</w:t>
+        <w:t>This is the gap we set out to close</w:t>
       </w:r>
       <w:r>
         <w:rPr>
@@ -728,7 +728,7 @@
           <w:i w:val="0"/>
           <w:sz w:val="22"/>
         </w:rPr>
-        <w:t>) show there is real demand for open, practical software in this space. No existing tool combines multi-source reference checking with a taxonomy that tells fabrication apart from "just not indexed" and from citation-matching failure. As far as I know, no study has estimated fabrication rates while correcting for both confounders at once, across disciplines and publishers.</w:t>
+        <w:t>) show there is real demand for open, practical software in this space. No existing tool combines multi-source reference checking with a taxonomy that tells fabrication apart from "just not indexed" and from citation-matching failure. As far as we know, no study has estimated fabrication rates while correcting for both confounders at once, across disciplines and publishers.</w:t>
       </w:r>
     </w:p>
     <w:p>
@@ -758,7 +758,7 @@
           <w:i w:val="0"/>
           <w:sz w:val="22"/>
         </w:rPr>
-        <w:t xml:space="preserve">, it turns the weak claim "I could not find this reference" into the defensible claim "this reference probably does not exist", by running every unmatched citation through progressively wider databases and a final human check. </w:t>
+        <w:t xml:space="preserve">, it turns the weak claim "we could not find this reference" into the defensible claim "this reference probably does not exist", by running every unmatched citation through progressively wider databases and a final human check. </w:t>
       </w:r>
       <w:r>
         <w:rPr>
@@ -798,7 +798,7 @@
         <w:pStyle w:val="Heading1"/>
       </w:pPr>
       <w:r>
-        <w:t>2. How I built and tested the checker</w:t>
+        <w:t>2. How we built and tested the checker</w:t>
       </w:r>
     </w:p>
     <w:p>
@@ -806,7 +806,7 @@
         <w:pStyle w:val="Heading2"/>
       </w:pPr>
       <w:r>
-        <w:t>2.1 What I sampled</w:t>
+        <w:t>2.1 What we sampled</w:t>
       </w:r>
     </w:p>
     <w:p>
@@ -820,7 +820,7 @@
           <w:i w:val="0"/>
           <w:sz w:val="22"/>
         </w:rPr>
-        <w:t>I looked at individual reference strings, not whole articles. I took a random sample of 2024 journal articles from Crossref that had deposited reference lists. At the time of sampling, Crossref held 6,092,408 journal articles from 2024, and 57.2% of them had a reference list attached. Within those lists, about 31% of references are "unresolved": raw text with no linked DOI. That unresolved set is what I am interested in, because a fabricated reference, having nothing real behind it, can never carry a resolved DOI. From roughly 1,200 sampled articles I pulled 5,000 unresolved reference strings, keeping the citing article's DOI as provenance for each one. One caveat up front: journals that deposit open reference lists tend to be the more careful ones, so my numbers should read as a lower bound on the wider literature.</w:t>
+        <w:t>We looked at individual reference strings, not whole articles. We took a random sample of 2024 journal articles from Crossref that had deposited reference lists. At the time of sampling, Crossref held 6,092,408 journal articles from 2024, and 57.2% of them had a reference list attached. Within those lists, about 31% of references are "unresolved": raw text with no linked DOI. That unresolved set is what we are interested in, because a fabricated reference, having nothing real behind it, can never carry a resolved DOI. From roughly 1,200 sampled articles we pulled 5,000 unresolved reference strings, keeping the citing article's DOI as provenance for each one. One caveat up front: journals that deposit open reference lists tend to be the more careful ones, so our numbers should read as a lower bound on the wider literature.</w:t>
       </w:r>
     </w:p>
     <w:p>
@@ -854,7 +854,7 @@
         <w:rPr>
           <w:sz w:val="22"/>
         </w:rPr>
-        <w:t>Step 1 -- Crossref. If the string has a DOI, I resolve it directly. If not, I run a bibliographic search and accept the best title match.</w:t>
+        <w:t>Step 1 -- Crossref. If the string has a DOI, we resolve it directly. If not, we run a bibliographic search and accept the best title match.</w:t>
       </w:r>
     </w:p>
     <w:p>
@@ -898,7 +898,7 @@
         <w:pStyle w:val="Heading2"/>
       </w:pPr>
       <w:r>
-        <w:t>2.3 How I decide on a match</w:t>
+        <w:t>2.3 How we decide on a match</w:t>
       </w:r>
     </w:p>
     <w:p>
@@ -912,7 +912,7 @@
           <w:i w:val="0"/>
           <w:sz w:val="22"/>
         </w:rPr>
-        <w:t>A match is accepted when enough of a candidate title's significant words (longer than three letters) appear in the reference string, with three safeguards I calibrated on a test set of known-good and known-fake references: short titles (fewer than three significant words) need a near-perfect match plus the first author's surname; if the registered author's surname is missing from the reference, I require a near-perfect title match; and I allow the cited year to be off by up to two years, to absorb the gap between a paper's online-first date and its print date.</w:t>
+        <w:t>A match is accepted when enough of a candidate title's significant words (longer than three letters) appear in the reference string, with three safeguards we calibrated on a test set of known-good and known-fake references: short titles (fewer than three significant words) need a near-perfect match plus the first author's surname; if the registered author's surname is missing from the reference, we require a near-perfect title match; and we allow the cited year to be off by up to two years, to absorb the gap between a paper's online-first date and its print date.</w:t>
       </w:r>
     </w:p>
     <w:p>
@@ -934,7 +934,7 @@
           <w:i w:val="0"/>
           <w:sz w:val="22"/>
         </w:rPr>
-        <w:t xml:space="preserve">I check retraction status two ways in OpenAlex: by DOI, and by title. The second check matters because some publishers register duplicate DOIs for the same paper, and the retraction flag sometimes sits on only one of them. In my test set, the retracted Wakefield et al. (1998) </w:t>
+        <w:t xml:space="preserve">We check retraction status two ways in OpenAlex: by DOI, and by title. The second check matters because some publishers register duplicate DOIs for the same paper, and the retraction flag sometimes sits on only one of them. In our test set, the retracted Wakefield et al. (1998) </w:t>
       </w:r>
       <w:r>
         <w:rPr>
@@ -966,7 +966,7 @@
           <w:i w:val="0"/>
           <w:sz w:val="22"/>
         </w:rPr>
-        <w:t xml:space="preserve"> retracted, while its canonical DOI carried the flag correctly. A DOI-only check would miss it. I think other retraction-screening tools likely have the same blind spot.</w:t>
+        <w:t xml:space="preserve"> retracted, while its canonical DOI carried the flag correctly. A DOI-only check would miss it. We think other retraction-screening tools likely have the same blind spot.</w:t>
       </w:r>
     </w:p>
     <w:p>
@@ -974,7 +974,7 @@
         <w:pStyle w:val="Heading2"/>
       </w:pPr>
       <w:r>
-        <w:t>2.5 Checking my own checking</w:t>
+        <w:t>2.5 Checking our own checking</w:t>
       </w:r>
     </w:p>
     <w:p>
@@ -988,7 +988,7 @@
           <w:i w:val="0"/>
           <w:sz w:val="22"/>
         </w:rPr>
-        <w:t>For the survivors -- references that made it through all three databases -- I hand-checked every one published from 2020 onward, since that is where LLM-era fabrication, if it exists, would concentrate. I searched each one online and sorted it into: confirmed real (with the venue), unverifiable by design (author-only citation, no title to search), ambiguous (a real-looking journal I could not confirm by web search), or fabricated.</w:t>
+        <w:t>For the survivors -- references that made it through all three databases -- we hand-checked every one published from 2020 onward, since that is where LLM-era fabrication, if it exists, would concentrate. We searched each one online and sorted it into: confirmed real (with the venue), unverifiable by design (author-only citation, no title to search), ambiguous (a real-looking journal we could not confirm by web search), or fabricated.</w:t>
       </w:r>
     </w:p>
     <w:p>
@@ -1058,7 +1058,7 @@
           <w:i w:val="0"/>
           <w:sz w:val="22"/>
         </w:rPr>
-        <w:t xml:space="preserve">Crossref and OpenAlex both allow cross-origin browser requests, so I built steps 1-2 of the check as a page that runs entirely in the visitor's browser: no reference text goes anywhere except to those two databases, and there is nothing to install. Anyone can paste a bibliography at </w:t>
+        <w:t xml:space="preserve">Crossref and OpenAlex both allow cross-origin browser requests, so we built steps 1-2 of the check as a page that runs entirely in the visitor's browser: no reference text goes anywhere except to those two databases, and there is nothing to install. Anyone can paste a bibliography at </w:t>
       </w:r>
       <w:r>
         <w:rPr>
@@ -1470,7 +1470,7 @@
         <w:pStyle w:val="Heading1"/>
       </w:pPr>
       <w:r>
-        <w:t>3. What I found</w:t>
+        <w:t>3. What we found</w:t>
       </w:r>
     </w:p>
     <w:p>
@@ -2171,7 +2171,7 @@
           <w:i w:val="0"/>
           <w:sz w:val="22"/>
         </w:rPr>
-        <w:t>Recovering 25% of "unresolved" references is itself a useful finding: a quarter of the citations Crossref's own data had left dangling turn out to resolve fine with a more forgiving matcher. I found real, findable papers in Nature, Physical Review D, Astroparticle Physics, and American Family Physician among the recovered set -- all indexed, all missed because the citation was abbreviated, led with the title instead of the author, or otherwise mangled.</w:t>
+        <w:t>Recovering 25% of "unresolved" references is itself a useful finding: a quarter of the citations Crossref's own data had left dangling turn out to resolve fine with a more forgiving matcher. We found real, findable papers in Nature, Physical Review D, Astroparticle Physics, and American Family Physician among the recovered set -- all indexed, all missed because the citation was abbreviated, led with the title instead of the author, or otherwise mangled.</w:t>
       </w:r>
     </w:p>
     <w:p>
@@ -2193,7 +2193,7 @@
           <w:i w:val="0"/>
           <w:sz w:val="22"/>
         </w:rPr>
-        <w:t>12.3% of unresolved references cite a real paper under a year that is off by more than two. Sloppy citing, in other words, is an order of magnitude more common in this sample than any plausible fabrication rate -- and, as far as I can tell, no one has put a number on this before at this scale.</w:t>
+        <w:t>12.3% of unresolved references cite a real paper under a year that is off by more than two. Sloppy citing, in other words, is an order of magnitude more common in this sample than any plausible fabrication rate -- and, as far as we can tell, no one has put a number on this before at this scale.</w:t>
       </w:r>
     </w:p>
     <w:p>
@@ -2237,7 +2237,7 @@
           <w:i w:val="0"/>
           <w:sz w:val="22"/>
         </w:rPr>
-        <w:t>421 references (8.4% of the sample) survived all three databases. I hand-checked every one of the 101 most recent (2020 onward) -- the highest-risk group -- with the results in Table 2: 80.2% turned out to be real, 9.9% were author-only citations with nothing to search on, 9.9% were real-looking journals I could not confirm online, and none were confirmed fabricated.</w:t>
+        <w:t>421 references (8.4% of the sample) survived all three databases. We hand-checked every one of the 101 most recent (2020 onward) -- the highest-risk group -- with the results in Table 2: 80.2% turned out to be real, 9.9% were author-only citations with nothing to search on, 9.9% were real-looking journals we could not confirm online, and none were confirmed fabricated.</w:t>
       </w:r>
     </w:p>
     <w:p>
@@ -2574,7 +2574,7 @@
                 <w:b w:val="0"/>
                 <w:sz w:val="19"/>
               </w:rPr>
-              <w:t>Real-looking Chinese-language journals I could not confirm</w:t>
+              <w:t>Real-looking Chinese-language journals we could not confirm</w:t>
             </w:r>
           </w:p>
         </w:tc>
@@ -2702,7 +2702,7 @@
           <w:i w:val="0"/>
           <w:sz w:val="22"/>
         </w:rPr>
-        <w:t xml:space="preserve"> -- a real paper, with a DOI in Crossref, whose citation was too mangled or title-first to match; publication in a delisted or predatory venue; or an author-only citation with no title at all. I found no evidence of fabrication in this sample. The true rate here looks close to zero, and almost all of the raw "survivor" count is explained by invisible-but-real scholarship and matching failures, not by made-up references.</w:t>
+        <w:t xml:space="preserve"> -- a real paper, with a DOI in Crossref, whose citation was too mangled or title-first to match; publication in a delisted or predatory venue; or an author-only citation with no title at all. We found no evidence of fabrication in this sample. The true rate here looks close to zero, and almost all of the raw "survivor" count is explained by invisible-but-real scholarship and matching failures, not by made-up references.</w:t>
       </w:r>
     </w:p>
     <w:p>
@@ -2772,7 +2772,7 @@
           <w:i w:val="0"/>
           <w:sz w:val="22"/>
         </w:rPr>
-        <w:t>My main finding reframes the fabricated-citation problem. Across disciplines, genuine fabrication is not just rare -- it is invisible unless you first strip away two things that get confused with it. One is how fragile citation matching still is: abbreviated journal names, title-first citations, and author-only styles defeat automatic checks even for papers in Nature or Physical Review D. The other is how much real scholarship -- regional, non-English, delisted -- never makes it into the big databases at all.</w:t>
+        <w:t>Our main finding reframes the fabricated-citation problem. Across disciplines, genuine fabrication is not just rare -- it is invisible unless you first strip away two things that get confused with it. One is how fragile citation matching still is: abbreviated journal names, title-first citations, and author-only styles defeat automatic checks even for papers in Nature or Physical Review D. The other is how much real scholarship -- regional, non-English, delisted -- never makes it into the big databases at all.</w:t>
       </w:r>
     </w:p>
     <w:p>
@@ -2800,7 +2800,7 @@
           <w:i w:val="0"/>
           <w:sz w:val="22"/>
         </w:rPr>
-        <w:t>I would also add a category that deserves its own name: the mangled citation -- a real paper made unmatchable by extreme abbreviation. Telling it apart from both fabrication and invisibility matters for getting the accounting right.</w:t>
+        <w:t>We would also add a category that deserves its own name: the mangled citation -- a real paper made unmatchable by extreme abbreviation. Telling it apart from both fabrication and invisibility matters for getting the accounting right.</w:t>
       </w:r>
     </w:p>
     <w:p>
@@ -2822,7 +2822,7 @@
           <w:i w:val="0"/>
           <w:sz w:val="22"/>
         </w:rPr>
-        <w:t xml:space="preserve">Unlike the fabrication estimate, which I report as an upper bound pending a bigger study (Section 3.5), the checker described in Section 2.7 is something anyone can use today: live, free, and needing nothing more than a browser. I see this as a complement to the research finding, not a side project. A tool that reports a raw </w:t>
+        <w:t xml:space="preserve">Unlike the fabrication estimate, which we report as an upper bound pending a bigger study (Section 3.5), the checker described in Section 2.7 is something anyone can use today: live, free, and needing nothing more than a browser. We see this as a complement to the research finding, not a side project. A tool that reports a raw </w:t>
       </w:r>
       <w:r>
         <w:rPr>
@@ -2838,7 +2838,7 @@
           <w:i w:val="0"/>
           <w:sz w:val="22"/>
         </w:rPr>
-        <w:t xml:space="preserve"> as a confident verdict repeats, in code, exactly the mistake this paper argues against on paper -- and mine briefly did just that.</w:t>
+        <w:t xml:space="preserve"> as a confident verdict repeats, in code, exactly the mistake this paper argues against on paper -- and ours briefly did just that.</w:t>
       </w:r>
     </w:p>
     <w:p>
@@ -2906,7 +2906,7 @@
           <w:i w:val="0"/>
           <w:sz w:val="22"/>
         </w:rPr>
-        <w:t xml:space="preserve">While testing the live tool (Figure 2), I found a bug: a rate-limited (HTTP 429) response from OpenAlex was being silently read as a confirmed </w:t>
+        <w:t xml:space="preserve">While testing the live tool (Figure 2), we found a bug: a rate-limited (HTTP 429) response from OpenAlex was being silently read as a confirmed </w:t>
       </w:r>
       <w:r>
         <w:rPr>
@@ -2922,7 +2922,7 @@
           <w:i w:val="0"/>
           <w:sz w:val="22"/>
         </w:rPr>
-        <w:t xml:space="preserve"> result, instead of as a failed check. I fixed it so a failed check now says so plainly -- "retraction status could not be confirmed, verify manually" -- instead of defaulting to a clean verdict. I think this is worth stating as a design rule, not a footnote: a screening tool should fail loudly, never quietly. Catching this under real conditions, not a simulated one, is a small piece of evidence that the taxonomy in this paper holds up in practice, not just on paper.</w:t>
+        <w:t xml:space="preserve"> result, instead of as a failed check. We fixed it so a failed check now says so plainly -- "retraction status could not be confirmed, verify manually" -- instead of defaulting to a clean verdict. We think this is worth stating as a design rule, not a footnote: a screening tool should fail loudly, never quietly. Catching this under real conditions, not a simulated one, is a small piece of evidence that the taxonomy in this paper holds up in practice, not just on paper.</w:t>
       </w:r>
     </w:p>
     <w:p>
@@ -2942,7 +2942,7 @@
         <w:rPr>
           <w:sz w:val="22"/>
         </w:rPr>
-        <w:t>Open-reference bias: journals that deposit open reference lists tend to be the more careful ones, so my numbers are a lower bound on the wider literature.</w:t>
+        <w:t>Open-reference bias: journals that deposit open reference lists tend to be the more careful ones, so our numbers are a lower bound on the wider literature.</w:t>
       </w:r>
     </w:p>
     <w:p>
@@ -2966,7 +2966,7 @@
         <w:rPr>
           <w:sz w:val="22"/>
         </w:rPr>
-        <w:t>Sample size: with zero fabrications observed, I can only state an upper bound, not a point estimate; a real estimate needs a much bigger sample.</w:t>
+        <w:t>Sample size: with zero fabrications observed, we can only state an upper bound, not a point estimate; a real estimate needs a much bigger sample.</w:t>
       </w:r>
     </w:p>
     <w:p>
@@ -2978,7 +2978,7 @@
         <w:rPr>
           <w:sz w:val="22"/>
         </w:rPr>
-        <w:t>No PDF parsing: I worked from deposited reference strings, not the full text of the citing papers.</w:t>
+        <w:t>No PDF parsing: we worked from deposited reference strings, not the full text of the citing papers.</w:t>
       </w:r>
     </w:p>
     <w:p>
@@ -3000,7 +3000,7 @@
           <w:i w:val="0"/>
           <w:sz w:val="22"/>
         </w:rPr>
-        <w:t>On the evidence here, fabricated references are a much smaller problem than raw, unvalidated detection would suggest. What looks like fabrication in a citation list is overwhelmingly real scholarship, hidden by indexing gaps and by citation matching that breaks too easily. A credible checking tool, and a credible prevalence number, both depend on telling these apart rather than lumping them together. I have built that tool, published the taxonomy behind it, and put both online for anyone to use. A properly powered, larger-scale prevalence study is the natural next step.</w:t>
+        <w:t>On the evidence here, fabricated references are a much smaller problem than raw, unvalidated detection would suggest. What looks like fabrication in a citation list is overwhelmingly real scholarship, hidden by indexing gaps and by citation matching that breaks too easily. A credible checking tool, and a credible prevalence number, both depend on telling these apart rather than lumping them together. We have built that tool, published the taxonomy behind it, and put both online for anyone to use. A properly powered, larger-scale prevalence study is the natural next step.</w:t>
       </w:r>
     </w:p>
     <w:p>
@@ -3076,7 +3076,7 @@
           <w:i w:val="0"/>
           <w:sz w:val="22"/>
         </w:rPr>
-        <w:t>The author declares no conflict of interest.</w:t>
+        <w:t>The authors declare no conflict of interest.</w:t>
       </w:r>
     </w:p>
     <w:p>
@@ -3120,7 +3120,33 @@
           <w:i w:val="0"/>
           <w:sz w:val="22"/>
         </w:rPr>
-        <w:t>D. Aristizábal Torres: conceptualisation, methodology, software, investigation, data curation, writing.</w:t>
+        <w:t>D. Aristizábal Torres: conceptualisation, methodology, software, investigation, data curation, writing. A. M. Barrera Rodríguez: [role to confirm -- e.g. validation, writing -- review &amp; editing, supervision].</w:t>
+      </w:r>
+    </w:p>
+    <w:p>
+      <w:pPr>
+        <w:spacing w:after="140"/>
+        <w:ind w:left="216"/>
+        <w:shd w:val="clear" w:fill="FFF3CD"/>
+        <w:pBdr>
+          <w:left w:val="single" w:sz="18" w:space="6" w:color="E0A800"/>
+        </w:pBdr>
+      </w:pPr>
+      <w:r>
+        <w:rPr>
+          <w:b/>
+          <w:color w:val="8A6D00"/>
+          <w:sz w:val="18"/>
+        </w:rPr>
+        <w:t xml:space="preserve">ACTION NEEDED  </w:t>
+      </w:r>
+      <w:r>
+        <w:rPr>
+          <w:i/>
+          <w:color w:val="6B5900"/>
+          <w:sz w:val="18"/>
+        </w:rPr>
+        <w:t>Confirm Ana María Barrera Rodríguez's specific contribution (CRediT role) so the statement is accurate -- this affects authorship order too, if it should not be Aristizábal Torres first.</w:t>
       </w:r>
     </w:p>
     <w:p>

</xml_diff>

<commit_message>
Add real author details and equal-contribution statement
Both files now carry both authors' institutional emails and ORCID iDs
(Universidad Libre, Colombia -- inferred from the unilibre.edu.co
domain; exact seccional/campus flagged as still needing confirmation),
plus an explicit "both authors contributed equally" note per author
instruction. Learned Publishing version: CRediT statement rewritten as
equal contribution across all roles; the ORCID action-needed callout
is resolved and removed.
</commit_message>
<xml_diff>
--- a/Manuscrito_LearnedPublishing_v1.docx
+++ b/Manuscrito_LearnedPublishing_v1.docx
@@ -26,7 +26,22 @@
           <w:i w:val="0"/>
           <w:sz w:val="24"/>
         </w:rPr>
-        <w:t>Daniel Aristizábal Torres¹ and Ana María Barrera Rodríguez²</w:t>
+        <w:t>Daniel Aristizábal Torres and Ana María Barrera Rodríguez</w:t>
+      </w:r>
+    </w:p>
+    <w:p>
+      <w:pPr>
+        <w:spacing w:after="40"/>
+        <w:jc w:val="center"/>
+      </w:pPr>
+      <w:r>
+        <w:rPr>
+          <w:b w:val="0"/>
+          <w:i/>
+          <w:color w:val="595959"/>
+          <w:sz w:val="18"/>
+        </w:rPr>
+        <w:t>Both authors contributed equally to this work.</w:t>
       </w:r>
     </w:p>
     <w:p>
@@ -41,7 +56,91 @@
           <w:color w:val="595959"/>
           <w:sz w:val="20"/>
         </w:rPr>
-        <w:t>¹ Independent Researcher — Scientometrics and Research Integrity   ·   ² [affiliation to confirm]</w:t>
+        <w:t>Universidad Libre, [Bogotá — city/seccional to confirm], Colombia</w:t>
+      </w:r>
+    </w:p>
+    <w:p>
+      <w:pPr>
+        <w:spacing w:after="20"/>
+        <w:jc w:val="center"/>
+      </w:pPr>
+      <w:r>
+        <w:rPr>
+          <w:b w:val="0"/>
+          <w:i w:val="0"/>
+          <w:color w:val="595959"/>
+          <w:sz w:val="18"/>
+        </w:rPr>
+        <w:t xml:space="preserve">D. Aristizábal Torres: </w:t>
+      </w:r>
+      <w:r>
+        <w:rPr>
+          <w:b w:val="0"/>
+          <w:i w:val="0"/>
+          <w:color w:val="595959"/>
+          <w:sz w:val="18"/>
+        </w:rPr>
+        <w:t>daniel.aristizabalt@unilibre.edu.co</w:t>
+      </w:r>
+      <w:r>
+        <w:rPr>
+          <w:b w:val="0"/>
+          <w:i w:val="0"/>
+          <w:color w:val="595959"/>
+          <w:sz w:val="18"/>
+        </w:rPr>
+        <w:t xml:space="preserve"> · ORCID </w:t>
+      </w:r>
+      <w:r>
+        <w:rPr>
+          <w:b w:val="0"/>
+          <w:i w:val="0"/>
+          <w:color w:val="595959"/>
+          <w:sz w:val="18"/>
+        </w:rPr>
+        <w:t>0000-0002-6552-2585</w:t>
+      </w:r>
+    </w:p>
+    <w:p>
+      <w:pPr>
+        <w:spacing w:after="40"/>
+        <w:jc w:val="center"/>
+      </w:pPr>
+      <w:r>
+        <w:rPr>
+          <w:b w:val="0"/>
+          <w:i w:val="0"/>
+          <w:color w:val="595959"/>
+          <w:sz w:val="18"/>
+        </w:rPr>
+        <w:t xml:space="preserve">A. M. Barrera Rodríguez: </w:t>
+      </w:r>
+      <w:r>
+        <w:rPr>
+          <w:b w:val="0"/>
+          <w:i w:val="0"/>
+          <w:color w:val="595959"/>
+          <w:sz w:val="18"/>
+        </w:rPr>
+        <w:t>anam.barrerar@unilibre.edu.co</w:t>
+      </w:r>
+      <w:r>
+        <w:rPr>
+          <w:b w:val="0"/>
+          <w:i w:val="0"/>
+          <w:color w:val="595959"/>
+          <w:sz w:val="18"/>
+        </w:rPr>
+        <w:t xml:space="preserve"> · ORCID </w:t>
+      </w:r>
+      <w:r>
+        <w:rPr>
+          <w:b w:val="0"/>
+          <w:i w:val="0"/>
+          <w:color w:val="595959"/>
+          <w:sz w:val="18"/>
+        </w:rPr>
+        <w:t>0000-0003-4949-6118</w:t>
       </w:r>
     </w:p>
     <w:p>
@@ -56,7 +155,7 @@
           <w:color w:val="595959"/>
           <w:sz w:val="18"/>
         </w:rPr>
-        <w:t>danielaristo@yahoo.com  ·  [Ana María Barrera Rodríguez's email — to confirm]  ·  ORCID: [both authors to insert]  ·  github.com/danielaristo/reference-integrity-checker</w:t>
+        <w:t>Code and tool: github.com/danielaristo/reference-integrity-checker</w:t>
       </w:r>
     </w:p>
     <w:p>
@@ -97,7 +196,7 @@
           <w:color w:val="6B5900"/>
           <w:sz w:val="18"/>
         </w:rPr>
-        <w:t>Learned Publishing requires an ORCID iD for every author (see Author Guidelines, "ORCID"). Both authors should register at orcid.org (2 minutes each) and send the two IDs so they can go on the title page and submission form.</w:t>
+        <w:t>Affiliation shows Universidad Libre, Colombia (inferred from the unilibre.edu.co email domain) with Bogotá as a placeholder city, since Universidad Libre has several seccionales (Bogotá, Cali, Barranquilla, Pereira, Cartagena, Cúcuta, Socorro). Confirm the correct campus/seccional and faculty or department before submission.</w:t>
       </w:r>
     </w:p>
     <w:p>
@@ -3120,33 +3219,7 @@
           <w:i w:val="0"/>
           <w:sz w:val="22"/>
         </w:rPr>
-        <w:t>D. Aristizábal Torres: conceptualisation, methodology, software, investigation, data curation, writing. A. M. Barrera Rodríguez: [role to confirm -- e.g. validation, writing -- review &amp; editing, supervision].</w:t>
-      </w:r>
-    </w:p>
-    <w:p>
-      <w:pPr>
-        <w:spacing w:after="140"/>
-        <w:ind w:left="216"/>
-        <w:shd w:val="clear" w:fill="FFF3CD"/>
-        <w:pBdr>
-          <w:left w:val="single" w:sz="18" w:space="6" w:color="E0A800"/>
-        </w:pBdr>
-      </w:pPr>
-      <w:r>
-        <w:rPr>
-          <w:b/>
-          <w:color w:val="8A6D00"/>
-          <w:sz w:val="18"/>
-        </w:rPr>
-        <w:t xml:space="preserve">ACTION NEEDED  </w:t>
-      </w:r>
-      <w:r>
-        <w:rPr>
-          <w:i/>
-          <w:color w:val="6B5900"/>
-          <w:sz w:val="18"/>
-        </w:rPr>
-        <w:t>Confirm Ana María Barrera Rodríguez's specific contribution (CRediT role) so the statement is accurate -- this affects authorship order too, if it should not be Aristizábal Torres first.</w:t>
+        <w:t>D. Aristizábal Torres and A. M. Barrera Rodríguez contributed equally to this work: conceptualisation, methodology, software, investigation, data curation, and writing.</w:t>
       </w:r>
     </w:p>
     <w:p>

</xml_diff>

<commit_message>
Finalize author affiliations: Universidad Libre Seccional Pereira
Daniel Aristizábal Torres -- Facultad de Ingeniería
Ana María Barrera Rodríguez -- Facultad de Ciencias Económicas,
Administrativas y Contables

Both faculties are within the same seccional (Pereira, Colombia),
shown with superscript markers since they differ. Removes the
now-resolved affiliation ACTION NEEDED callout from the Learned
Publishing draft; only the APC/waiver check remains flagged.
</commit_message>
<xml_diff>
--- a/Manuscrito_LearnedPublishing_v1.docx
+++ b/Manuscrito_LearnedPublishing_v1.docx
@@ -26,7 +26,7 @@
           <w:i w:val="0"/>
           <w:sz w:val="24"/>
         </w:rPr>
-        <w:t>Daniel Aristizábal Torres and Ana María Barrera Rodríguez</w:t>
+        <w:t>Daniel Aristizábal Torres¹ and Ana María Barrera Rodríguez²</w:t>
       </w:r>
     </w:p>
     <w:p>
@@ -46,6 +46,21 @@
     </w:p>
     <w:p>
       <w:pPr>
+        <w:spacing w:after="20"/>
+        <w:jc w:val="center"/>
+      </w:pPr>
+      <w:r>
+        <w:rPr>
+          <w:b w:val="0"/>
+          <w:i/>
+          <w:color w:val="595959"/>
+          <w:sz w:val="20"/>
+        </w:rPr>
+        <w:t>¹ Facultad de Ingeniería, Universidad Libre Seccional Pereira, Pereira, Colombia</w:t>
+      </w:r>
+    </w:p>
+    <w:p>
+      <w:pPr>
         <w:spacing w:after="40"/>
         <w:jc w:val="center"/>
       </w:pPr>
@@ -56,7 +71,7 @@
           <w:color w:val="595959"/>
           <w:sz w:val="20"/>
         </w:rPr>
-        <w:t>Universidad Libre, [Bogotá — city/seccional to confirm], Colombia</w:t>
+        <w:t>² Facultad de Ciencias Económicas, Administrativas y Contables, Universidad Libre Seccional Pereira, Pereira, Colombia</w:t>
       </w:r>
     </w:p>
     <w:p>
@@ -171,32 +186,6 @@
           <w:sz w:val="18"/>
         </w:rPr>
         <w:t>Submission type: Original article · Learned Publishing (Wiley) · Working draft</w:t>
-      </w:r>
-    </w:p>
-    <w:p>
-      <w:pPr>
-        <w:spacing w:after="140"/>
-        <w:ind w:left="216"/>
-        <w:shd w:val="clear" w:fill="FFF3CD"/>
-        <w:pBdr>
-          <w:left w:val="single" w:sz="18" w:space="6" w:color="E0A800"/>
-        </w:pBdr>
-      </w:pPr>
-      <w:r>
-        <w:rPr>
-          <w:b/>
-          <w:color w:val="8A6D00"/>
-          <w:sz w:val="18"/>
-        </w:rPr>
-        <w:t xml:space="preserve">ACTION NEEDED  </w:t>
-      </w:r>
-      <w:r>
-        <w:rPr>
-          <w:i/>
-          <w:color w:val="6B5900"/>
-          <w:sz w:val="18"/>
-        </w:rPr>
-        <w:t>Affiliation shows Universidad Libre, Colombia (inferred from the unilibre.edu.co email domain) with Bogotá as a placeholder city, since Universidad Libre has several seccionales (Bogotá, Cali, Barranquilla, Pereira, Cartagena, Cúcuta, Socorro). Confirm the correct campus/seccional and faculty or department before submission.</w:t>
       </w:r>
     </w:p>
     <w:p>

</xml_diff>

<commit_message>
Remove title-page equal-contribution note; keep full CRediT statement
</commit_message>
<xml_diff>
--- a/Manuscrito_LearnedPublishing_v1.docx
+++ b/Manuscrito_LearnedPublishing_v1.docx
@@ -27,21 +27,6 @@
           <w:sz w:val="24"/>
         </w:rPr>
         <w:t>Daniel Aristizábal Torres¹, Ana María Barrera Rodríguez², Cristhian Camilo Amariles López³, Alejandro Alzate Buitrago¹, and Juan Quinteros Escobar⁴</w:t>
-      </w:r>
-    </w:p>
-    <w:p>
-      <w:pPr>
-        <w:spacing w:after="40"/>
-        <w:jc w:val="center"/>
-      </w:pPr>
-      <w:r>
-        <w:rPr>
-          <w:b w:val="0"/>
-          <w:i/>
-          <w:color w:val="595959"/>
-          <w:sz w:val="18"/>
-        </w:rPr>
-        <w:t>D. Aristizábal Torres and A. M. Barrera Rodríguez contributed equally to this work.</w:t>
       </w:r>
     </w:p>
     <w:p>

</xml_diff>

<commit_message>
Translate faculty/affiliation names to English on title page
Co-Authored-By: Claude Sonnet 5 <noreply@anthropic.com>
</commit_message>
<xml_diff>
--- a/Manuscrito_LearnedPublishing_v1.docx
+++ b/Manuscrito_LearnedPublishing_v1.docx
@@ -41,7 +41,7 @@
           <w:color w:val="595959"/>
           <w:sz w:val="20"/>
         </w:rPr>
-        <w:t>¹ Facultad de Ingeniería, Universidad Libre Seccional Pereira, Pereira, Colombia</w:t>
+        <w:t>¹ Faculty of Engineering, Universidad Libre Seccional Pereira, Pereira, Colombia</w:t>
       </w:r>
     </w:p>
     <w:p>
@@ -56,7 +56,7 @@
           <w:color w:val="595959"/>
           <w:sz w:val="20"/>
         </w:rPr>
-        <w:t>² Facultad de Ciencias Económicas, Administrativas y Contables, Universidad Libre Seccional Pereira, Pereira, Colombia</w:t>
+        <w:t>² Faculty of Economic, Administrative and Accounting Sciences, Universidad Libre Seccional Pereira, Pereira, Colombia</w:t>
       </w:r>
     </w:p>
     <w:p>
@@ -71,7 +71,7 @@
           <w:color w:val="595959"/>
           <w:sz w:val="20"/>
         </w:rPr>
-        <w:t>³ Facultad de Mecánica Aplicada, Universidad Tecnológica de Pereira, Pereira, Colombia</w:t>
+        <w:t>³ Faculty of Applied Mechanical Engineering, Universidad Tecnológica de Pereira, Pereira, Colombia</w:t>
       </w:r>
     </w:p>
     <w:p>
@@ -86,7 +86,7 @@
           <w:color w:val="595959"/>
           <w:sz w:val="20"/>
         </w:rPr>
-        <w:t>⁴ Facultad de Educación, Comunicación y Humanidades, Universidad Nacional Jorge Basadre Grohmann, Tacna, Perú</w:t>
+        <w:t>⁴ Faculty of Education, Communication and Humanities, Universidad Nacional Jorge Basadre Grohmann, Tacna, Peru</w:t>
       </w:r>
     </w:p>
     <w:p>

</xml_diff>

<commit_message>
Replace two preprint references with peer-reviewed equivalents
Cabanac, Labbé & Magazinov (2021) arXiv preprint replaced with Cabanac
& Labbé (2021), JASIST — peer-reviewed, verified via Crossref. Kinney
et al. (2023) arXiv preprint replaced with Ammar et al. (2018), NAACL-HLT
Industry Papers — peer-reviewed, verified via Crossref. Also corrected
an inaccurate claim that Semantic Scholar "replaced" Microsoft Academic
Graph (only OpenAlex did); Semantic Scholar is described as an
independently built index instead.

Co-Authored-By: Claude Sonnet 5 <noreply@anthropic.com>
</commit_message>
<xml_diff>
--- a/Manuscrito_LearnedPublishing_v1.docx
+++ b/Manuscrito_LearnedPublishing_v1.docx
@@ -641,7 +641,7 @@
           <w:i w:val="0"/>
           <w:sz w:val="22"/>
         </w:rPr>
-        <w:t>), and retracted papers keep getting cited as if nothing happened. Organised fraud has scaled up too: paper mills now churn out fake manuscripts faster than forensic tools built to catch them, including tools that spot "tortured phrases" -- odd synonym-swapped wording used to dodge plagiarism checks (</w:t>
+        <w:t>), and retracted papers keep getting cited as if nothing happened. Organised fraud has scaled up too: paper mills now churn out fake manuscripts faster than forensic tools built to catch them, including tools that screen for nonsensical, algorithmically generated papers that made it past peer review (</w:t>
       </w:r>
       <w:r>
         <w:rPr>
@@ -649,7 +649,7 @@
           <w:i w:val="0"/>
           <w:sz w:val="22"/>
         </w:rPr>
-        <w:t>Cabanac et al., 2021</w:t>
+        <w:t>Cabanac &amp; Labbé, 2021</w:t>
       </w:r>
       <w:r>
         <w:rPr>
@@ -743,7 +743,7 @@
           <w:i w:val="0"/>
           <w:sz w:val="22"/>
         </w:rPr>
-        <w:t>) and Semantic Scholar (</w:t>
+        <w:t>) replaced Microsoft Academic Graph, and Semantic Scholar (</w:t>
       </w:r>
       <w:r>
         <w:rPr>
@@ -751,7 +751,7 @@
           <w:i w:val="0"/>
           <w:sz w:val="22"/>
         </w:rPr>
-        <w:t>Kinney et al., 2023</w:t>
+        <w:t>Ammar et al., 2018</w:t>
       </w:r>
       <w:r>
         <w:rPr>
@@ -759,7 +759,7 @@
           <w:i w:val="0"/>
           <w:sz w:val="22"/>
         </w:rPr>
-        <w:t>) replaced Microsoft Academic Graph with open, large-scale indexes, and OpenCitations (</w:t>
+        <w:t>) built its own independent, open, large-scale index; OpenCitations (</w:t>
       </w:r>
       <w:r>
         <w:rPr>
@@ -901,7 +901,7 @@
           <w:i w:val="0"/>
           <w:sz w:val="22"/>
         </w:rPr>
-        <w:t>Cabanac et al., 2021</w:t>
+        <w:t>Cabanac &amp; Labbé, 2021</w:t>
       </w:r>
       <w:r>
         <w:rPr>
@@ -3418,6 +3418,18 @@
         <w:rPr>
           <w:sz w:val="21"/>
         </w:rPr>
+        <w:t>Ammar, W., Groeneveld, D., Bhagavatula, C., et al. (2018). Construction of the literature graph in Semantic Scholar. Proceedings of NAACL-HLT 2018, Industry Papers, 84–91. https://doi.org/10.18653/v1/n18-3011</w:t>
+      </w:r>
+    </w:p>
+    <w:p>
+      <w:pPr>
+        <w:spacing w:after="160"/>
+        <w:ind w:left="432" w:hanging="432"/>
+      </w:pPr>
+      <w:r>
+        <w:rPr>
+          <w:sz w:val="21"/>
+        </w:rPr>
         <w:t>Aria, M., &amp; Cuccurullo, C. (2017). bibliometrix: An R-tool for comprehensive science mapping analysis. Journal of Informetrics, 11(4), 959–975. https://doi.org/10.1016/j.joi.2017.08.007</w:t>
       </w:r>
     </w:p>
@@ -3442,7 +3454,7 @@
         <w:rPr>
           <w:sz w:val="21"/>
         </w:rPr>
-        <w:t>Cabanac, G., Labbé, C., &amp; Magazinov, A. (2021). Tortured phrases: A dubious writing style emerging in science [Preprint]. arXiv:2107.06751. https://doi.org/10.48550/arXiv.2107.06751</w:t>
+        <w:t>Cabanac, G., &amp; Labbé, C. (2021). Prevalence of nonsensical algorithmically generated papers in the scientific literature. Journal of the Association for Information Science and Technology, 72(12), 1461–1476. https://doi.org/10.1002/asi.24495</w:t>
       </w:r>
     </w:p>
     <w:p>
@@ -3527,18 +3539,6 @@
           <w:sz w:val="21"/>
         </w:rPr>
         <w:t>Ji, Z., Lee, N., Frieske, R., et al. (2023). Survey of hallucination in natural language generation. ACM Computing Surveys, 55(12), 1–38. https://doi.org/10.1145/3571730</w:t>
-      </w:r>
-    </w:p>
-    <w:p>
-      <w:pPr>
-        <w:spacing w:after="160"/>
-        <w:ind w:left="432" w:hanging="432"/>
-      </w:pPr>
-      <w:r>
-        <w:rPr>
-          <w:sz w:val="21"/>
-        </w:rPr>
-        <w:t>Kinney, R., Anastasiades, C., Authur, R., et al. (2023). The Semantic Scholar Open Data Platform [Preprint]. arXiv:2301.10140. https://doi.org/10.48550/arXiv.2301.10140</w:t>
       </w:r>
     </w:p>
     <w:p>

</xml_diff>

<commit_message>
Fix table numbering order across all three manuscript versions
Table captions previously appeared out of order in the document: the
verdict-states table in Section 2.7 was labeled "Table 3" even though
it appears before the funnel table (Section 3.1) and the manual
verification table (Section 3.5), which were labeled "Table 1" and
"Table 2". Renumbered in reading order: verdict states -> Table 1,
funnel -> Table 2, manual verification -> Table 3.

Co-Authored-By: Claude Sonnet 5 <noreply@anthropic.com>
</commit_message>
<xml_diff>
--- a/Manuscrito_LearnedPublishing_v1.docx
+++ b/Manuscrito_LearnedPublishing_v1.docx
@@ -1303,7 +1303,7 @@
           <w:i w:val="0"/>
           <w:sz w:val="22"/>
         </w:rPr>
-        <w:t xml:space="preserve"> and get a verdict on each reference within seconds, plus a CSV export for the record. Table 3 shows how the tool's four labels map onto the categories from Section 2.5. The full four-database check, including Semantic Scholar and the hand review used for the results below, stays available as open-source command-line code in the same repository, since the Semantic Scholar key cannot safely live inside a public web page.</w:t>
+        <w:t xml:space="preserve"> and get a verdict on each reference within seconds, plus a CSV export for the record. Table 1 shows how the tool's four labels map onto the categories from Section 2.5. The full four-database check, including Semantic Scholar and the hand review used for the results below, stays available as open-source command-line code in the same repository, since the Semantic Scholar key cannot safely live inside a public web page.</w:t>
       </w:r>
     </w:p>
     <w:p>
@@ -1371,7 +1371,7 @@
           <w:i/>
           <w:sz w:val="19"/>
         </w:rPr>
-        <w:t>Table 3. What the free tool's labels mean.</w:t>
+        <w:t>Table 1. What the free tool's labels mean.</w:t>
       </w:r>
     </w:p>
     <w:tbl>
@@ -1721,7 +1721,7 @@
           <w:i w:val="0"/>
           <w:sz w:val="22"/>
         </w:rPr>
-        <w:t>Table 1 shows what happened to the 5,000-reference sample. A quarter of the references that Crossref itself had failed to link turned out to be real papers -- the standard matcher had simply missed them. Another eighth cited a real paper under the wrong year. Just under two-thirds were not in either database at all. Of those, 517 (about one in ten of the whole sample) looked like genuine journal articles and went forward for the deeper check; the rest were books, standards, patents, reports, theses, and web pages.</w:t>
+        <w:t>Table 2 shows what happened to the 5,000-reference sample. A quarter of the references that Crossref itself had failed to link turned out to be real papers -- the standard matcher had simply missed them. Another eighth cited a real paper under the wrong year. Just under two-thirds were not in either database at all. Of those, 517 (about one in ten of the whole sample) looked like genuine journal articles and went forward for the deeper check; the rest were books, standards, patents, reports, theses, and web pages.</w:t>
       </w:r>
     </w:p>
     <w:p>
@@ -1735,7 +1735,7 @@
           <w:i/>
           <w:sz w:val="19"/>
         </w:rPr>
-        <w:t>Table 1. What happened to 5,000 unresolved references from 2024 papers.</w:t>
+        <w:t>Table 2. What happened to 5,000 unresolved references from 2024 papers.</w:t>
       </w:r>
     </w:p>
     <w:tbl>
@@ -2466,7 +2466,7 @@
           <w:i w:val="0"/>
           <w:sz w:val="22"/>
         </w:rPr>
-        <w:t>421 references (8.4% of the sample) survived all three databases. We hand-checked every one of the 101 most recent (2020 onward) -- the highest-risk group -- with the results in Table 2: 80.2% turned out to be real, 9.9% were author-only citations with nothing to search on, 9.9% were real-looking journals we could not confirm online, and none were confirmed fabricated.</w:t>
+        <w:t>421 references (8.4% of the sample) survived all three databases. We hand-checked every one of the 101 most recent (2020 onward) -- the highest-risk group -- with the results in Table 3: 80.2% turned out to be real, 9.9% were author-only citations with nothing to search on, 9.9% were real-looking journals we could not confirm online, and none were confirmed fabricated.</w:t>
       </w:r>
     </w:p>
     <w:p>
@@ -2480,7 +2480,7 @@
           <w:i/>
           <w:sz w:val="19"/>
         </w:rPr>
-        <w:t>Table 2. Hand-checking the 101 most recent (2020+) survivors.</w:t>
+        <w:t>Table 3. Hand-checking the 101 most recent (2020+) survivors.</w:t>
       </w:r>
     </w:p>
     <w:tbl>

</xml_diff>